<commit_message>
Epic 1 - Andrii Stekhnovych
</commit_message>
<xml_diff>
--- a/ai_11/andrii_stekhnovych/epic_1/epic_1_report_andrii_stekhnovych.docx
+++ b/ai_11/andrii_stekhnovych/epic_1/epic_1_report_andrii_stekhnovych.docx
@@ -141,12 +141,12 @@
           <wp:inline distB="0" distT="0" distL="114300" distR="114300">
             <wp:extent cx="2724150" cy="2571750"/>
             <wp:effectExtent b="0" l="0" r="0" t="0"/>
-            <wp:docPr descr="A blue and white logo&#10;&#10;Description automatically generated" id="1" name="image2.png"/>
+            <wp:docPr descr="A blue and white logo&#10;&#10;Description automatically generated" id="1" name="image1.png"/>
             <a:graphic>
               <a:graphicData uri="http://schemas.openxmlformats.org/drawingml/2006/picture">
                 <pic:pic>
                   <pic:nvPicPr>
-                    <pic:cNvPr descr="A blue and white logo&#10;&#10;Description automatically generated" id="0" name="image2.png"/>
+                    <pic:cNvPr descr="A blue and white logo&#10;&#10;Description automatically generated" id="0" name="image1.png"/>
                     <pic:cNvPicPr preferRelativeResize="0"/>
                   </pic:nvPicPr>
                   <pic:blipFill>
@@ -5559,12 +5559,12 @@
           <wp:inline distB="114300" distT="114300" distL="114300" distR="114300">
             <wp:extent cx="2418398" cy="3943513"/>
             <wp:effectExtent b="0" l="0" r="0" t="0"/>
-            <wp:docPr id="6" name="image5.png"/>
+            <wp:docPr id="6" name="image2.png"/>
             <a:graphic>
               <a:graphicData uri="http://schemas.openxmlformats.org/drawingml/2006/picture">
                 <pic:pic>
                   <pic:nvPicPr>
-                    <pic:cNvPr id="0" name="image5.png"/>
+                    <pic:cNvPr id="0" name="image2.png"/>
                     <pic:cNvPicPr preferRelativeResize="0"/>
                   </pic:nvPicPr>
                   <pic:blipFill>
@@ -5901,12 +5901,12 @@
           <wp:inline distB="0" distT="0" distL="114300" distR="114300">
             <wp:extent cx="3627283" cy="1589016"/>
             <wp:effectExtent b="0" l="0" r="0" t="0"/>
-            <wp:docPr id="3" name="image10.png"/>
+            <wp:docPr id="3" name="image16.png"/>
             <a:graphic>
               <a:graphicData uri="http://schemas.openxmlformats.org/drawingml/2006/picture">
                 <pic:pic>
                   <pic:nvPicPr>
-                    <pic:cNvPr id="0" name="image10.png"/>
+                    <pic:cNvPr id="0" name="image16.png"/>
                     <pic:cNvPicPr preferRelativeResize="0"/>
                   </pic:nvPicPr>
                   <pic:blipFill>
@@ -5969,12 +5969,12 @@
           <wp:inline distB="0" distT="0" distL="114300" distR="114300">
             <wp:extent cx="3829050" cy="1787276"/>
             <wp:effectExtent b="0" l="0" r="0" t="0"/>
-            <wp:docPr id="2" name="image15.png"/>
+            <wp:docPr id="2" name="image8.png"/>
             <a:graphic>
               <a:graphicData uri="http://schemas.openxmlformats.org/drawingml/2006/picture">
                 <pic:pic>
                   <pic:nvPicPr>
-                    <pic:cNvPr id="0" name="image15.png"/>
+                    <pic:cNvPr id="0" name="image8.png"/>
                     <pic:cNvPicPr preferRelativeResize="0"/>
                   </pic:nvPicPr>
                   <pic:blipFill>
@@ -6075,12 +6075,12 @@
           <wp:inline distB="0" distT="0" distL="114300" distR="114300">
             <wp:extent cx="2829170" cy="2817622"/>
             <wp:effectExtent b="0" l="0" r="0" t="0"/>
-            <wp:docPr id="5" name="image11.png"/>
+            <wp:docPr id="5" name="image13.png"/>
             <a:graphic>
               <a:graphicData uri="http://schemas.openxmlformats.org/drawingml/2006/picture">
                 <pic:pic>
                   <pic:nvPicPr>
-                    <pic:cNvPr id="0" name="image11.png"/>
+                    <pic:cNvPr id="0" name="image13.png"/>
                     <pic:cNvPicPr preferRelativeResize="0"/>
                   </pic:nvPicPr>
                   <pic:blipFill>
@@ -6139,12 +6139,12 @@
           <wp:inline distB="0" distT="0" distL="114300" distR="114300">
             <wp:extent cx="4095750" cy="1664285"/>
             <wp:effectExtent b="0" l="0" r="0" t="0"/>
-            <wp:docPr id="4" name="image7.png"/>
+            <wp:docPr id="4" name="image14.png"/>
             <a:graphic>
               <a:graphicData uri="http://schemas.openxmlformats.org/drawingml/2006/picture">
                 <pic:pic>
                   <pic:nvPicPr>
-                    <pic:cNvPr id="0" name="image7.png"/>
+                    <pic:cNvPr id="0" name="image14.png"/>
                     <pic:cNvPicPr preferRelativeResize="0"/>
                   </pic:nvPicPr>
                   <pic:blipFill>
@@ -6228,12 +6228,12 @@
           <wp:inline distB="0" distT="0" distL="114300" distR="114300">
             <wp:extent cx="6305550" cy="2876550"/>
             <wp:effectExtent b="0" l="0" r="0" t="0"/>
-            <wp:docPr id="8" name="image3.png"/>
+            <wp:docPr id="8" name="image5.png"/>
             <a:graphic>
               <a:graphicData uri="http://schemas.openxmlformats.org/drawingml/2006/picture">
                 <pic:pic>
                   <pic:nvPicPr>
-                    <pic:cNvPr id="0" name="image3.png"/>
+                    <pic:cNvPr id="0" name="image5.png"/>
                     <pic:cNvPicPr preferRelativeResize="0"/>
                   </pic:nvPicPr>
                   <pic:blipFill>
@@ -6281,12 +6281,12 @@
           <wp:inline distB="0" distT="0" distL="114300" distR="114300">
             <wp:extent cx="6305550" cy="1638300"/>
             <wp:effectExtent b="0" l="0" r="0" t="0"/>
-            <wp:docPr id="7" name="image17.png"/>
+            <wp:docPr id="7" name="image3.png"/>
             <a:graphic>
               <a:graphicData uri="http://schemas.openxmlformats.org/drawingml/2006/picture">
                 <pic:pic>
                   <pic:nvPicPr>
-                    <pic:cNvPr id="0" name="image17.png"/>
+                    <pic:cNvPr id="0" name="image3.png"/>
                     <pic:cNvPicPr preferRelativeResize="0"/>
                   </pic:nvPicPr>
                   <pic:blipFill>
@@ -6355,12 +6355,12 @@
           <wp:inline distB="0" distT="0" distL="114300" distR="114300">
             <wp:extent cx="6305550" cy="609600"/>
             <wp:effectExtent b="0" l="0" r="0" t="0"/>
-            <wp:docPr id="10" name="image14.png"/>
+            <wp:docPr id="10" name="image11.png"/>
             <a:graphic>
               <a:graphicData uri="http://schemas.openxmlformats.org/drawingml/2006/picture">
                 <pic:pic>
                   <pic:nvPicPr>
-                    <pic:cNvPr id="0" name="image14.png"/>
+                    <pic:cNvPr id="0" name="image11.png"/>
                     <pic:cNvPicPr preferRelativeResize="0"/>
                   </pic:nvPicPr>
                   <pic:blipFill>
@@ -6450,12 +6450,12 @@
           <wp:inline distB="0" distT="0" distL="114300" distR="114300">
             <wp:extent cx="6305550" cy="1466850"/>
             <wp:effectExtent b="0" l="0" r="0" t="0"/>
-            <wp:docPr id="9" name="image1.png"/>
+            <wp:docPr id="9" name="image7.png"/>
             <a:graphic>
               <a:graphicData uri="http://schemas.openxmlformats.org/drawingml/2006/picture">
                 <pic:pic>
                   <pic:nvPicPr>
-                    <pic:cNvPr id="0" name="image1.png"/>
+                    <pic:cNvPr id="0" name="image7.png"/>
                     <pic:cNvPicPr preferRelativeResize="0"/>
                   </pic:nvPicPr>
                   <pic:blipFill>
@@ -6604,12 +6604,12 @@
           <wp:inline distB="0" distT="0" distL="114300" distR="114300">
             <wp:extent cx="5248275" cy="2418012"/>
             <wp:effectExtent b="0" l="0" r="0" t="0"/>
-            <wp:docPr id="11" name="image12.png"/>
+            <wp:docPr id="11" name="image6.png"/>
             <a:graphic>
               <a:graphicData uri="http://schemas.openxmlformats.org/drawingml/2006/picture">
                 <pic:pic>
                   <pic:nvPicPr>
-                    <pic:cNvPr id="0" name="image12.png"/>
+                    <pic:cNvPr id="0" name="image6.png"/>
                     <pic:cNvPicPr preferRelativeResize="0"/>
                   </pic:nvPicPr>
                   <pic:blipFill>
@@ -6666,17 +6666,33 @@
       <w:pPr>
         <w:rPr>
           <w:rFonts w:ascii="Times New Roman" w:cs="Times New Roman" w:eastAsia="Times New Roman" w:hAnsi="Times New Roman"/>
-          <w:sz w:val="24"/>
-          <w:szCs w:val="24"/>
-        </w:rPr>
-      </w:pPr>
-      <w:r>
-        <w:rPr>
-          <w:rFonts w:ascii="Times New Roman" w:cs="Times New Roman" w:eastAsia="Times New Roman" w:hAnsi="Times New Roman"/>
           <w:i w:val="1"/>
           <w:iCs w:val="1"/>
           <w:sz w:val="24"/>
           <w:szCs w:val="24"/>
+        </w:rPr>
+      </w:pPr>
+      <w:r>
+        <w:rPr>
+          <w:rtl w:val="0"/>
+        </w:rPr>
+      </w:r>
+    </w:p>
+    <w:p>
+      <w:pPr>
+        <w:rPr>
+          <w:rFonts w:ascii="Times New Roman" w:cs="Times New Roman" w:eastAsia="Times New Roman" w:hAnsi="Times New Roman"/>
+          <w:sz w:val="24"/>
+          <w:szCs w:val="24"/>
+        </w:rPr>
+      </w:pPr>
+      <w:r>
+        <w:rPr>
+          <w:rFonts w:ascii="Times New Roman" w:cs="Times New Roman" w:eastAsia="Times New Roman" w:hAnsi="Times New Roman"/>
+          <w:i w:val="1"/>
+          <w:iCs w:val="1"/>
+          <w:sz w:val="24"/>
+          <w:szCs w:val="24"/>
           <w:rtl w:val="0"/>
         </w:rPr>
         <w:t xml:space="preserve">Посилання на файл коду в пулреквесті</w:t>
@@ -6688,7 +6704,7 @@
           <w:szCs w:val="24"/>
           <w:rtl w:val="0"/>
         </w:rPr>
-        <w:t xml:space="preserve">: вставляєте посилання на файл в пулреквесті</w:t>
+        <w:t xml:space="preserve">: https://github.com/artificial-intelligence-department/ai_programming_playground_2026/blob/b01bd96769e39a193e47092933ecdbd7afba422a/ai_11/andrii_stekhnovych/epic_1/practice_task_1_andrii_stekhnovych.cpp</w:t>
       </w:r>
     </w:p>
     <w:p>
@@ -6719,12 +6735,12 @@
           <wp:inline distB="0" distT="0" distL="114300" distR="114300">
             <wp:extent cx="3558848" cy="6294665"/>
             <wp:effectExtent b="0" l="0" r="0" t="0"/>
-            <wp:docPr id="12" name="image13.png"/>
+            <wp:docPr id="12" name="image9.png"/>
             <a:graphic>
               <a:graphicData uri="http://schemas.openxmlformats.org/drawingml/2006/picture">
                 <pic:pic>
                   <pic:nvPicPr>
-                    <pic:cNvPr id="0" name="image13.png"/>
+                    <pic:cNvPr id="0" name="image9.png"/>
                     <pic:cNvPicPr preferRelativeResize="0"/>
                   </pic:nvPicPr>
                   <pic:blipFill>
@@ -6805,7 +6821,7 @@
           <w:szCs w:val="24"/>
           <w:rtl w:val="0"/>
         </w:rPr>
-        <w:t xml:space="preserve">: вставляєте посилання на файл в пулреквесті</w:t>
+        <w:t xml:space="preserve">: https://github.com/artificial-intelligence-department/ai_programming_playground_2026/blob/b01bd96769e39a193e47092933ecdbd7afba422a/ai_11/andrii_stekhnovych/epic_1/self_practice_algotester_task_1_andrii_stekhnovych.cpp</w:t>
       </w:r>
     </w:p>
     <w:p>
@@ -6868,12 +6884,12 @@
           <wp:inline distB="0" distT="0" distL="114300" distR="114300">
             <wp:extent cx="4465707" cy="2865368"/>
             <wp:effectExtent b="0" l="0" r="0" t="0"/>
-            <wp:docPr id="14" name="image6.png"/>
+            <wp:docPr id="14" name="image15.png"/>
             <a:graphic>
               <a:graphicData uri="http://schemas.openxmlformats.org/drawingml/2006/picture">
                 <pic:pic>
                   <pic:nvPicPr>
-                    <pic:cNvPr id="0" name="image6.png"/>
+                    <pic:cNvPr id="0" name="image15.png"/>
                     <pic:cNvPicPr preferRelativeResize="0"/>
                   </pic:nvPicPr>
                   <pic:blipFill>
@@ -6914,12 +6930,12 @@
           <wp:inline distB="0" distT="0" distL="114300" distR="114300">
             <wp:extent cx="4397121" cy="624894"/>
             <wp:effectExtent b="0" l="0" r="0" t="0"/>
-            <wp:docPr id="15" name="image8.png"/>
+            <wp:docPr id="15" name="image10.png"/>
             <a:graphic>
               <a:graphicData uri="http://schemas.openxmlformats.org/drawingml/2006/picture">
                 <pic:pic>
                   <pic:nvPicPr>
-                    <pic:cNvPr id="0" name="image8.png"/>
+                    <pic:cNvPr id="0" name="image10.png"/>
                     <pic:cNvPicPr preferRelativeResize="0"/>
                   </pic:nvPicPr>
                   <pic:blipFill>
@@ -7016,12 +7032,12 @@
           <wp:inline distB="0" distT="0" distL="114300" distR="114300">
             <wp:extent cx="4237087" cy="1874682"/>
             <wp:effectExtent b="0" l="0" r="0" t="0"/>
-            <wp:docPr id="16" name="image9.png"/>
+            <wp:docPr id="16" name="image12.png"/>
             <a:graphic>
               <a:graphicData uri="http://schemas.openxmlformats.org/drawingml/2006/picture">
                 <pic:pic>
                   <pic:nvPicPr>
-                    <pic:cNvPr id="0" name="image9.png"/>
+                    <pic:cNvPr id="0" name="image12.png"/>
                     <pic:cNvPicPr preferRelativeResize="0"/>
                   </pic:nvPicPr>
                   <pic:blipFill>
@@ -7181,12 +7197,12 @@
           <wp:inline distB="0" distT="0" distL="114300" distR="114300">
             <wp:extent cx="6305550" cy="2447925"/>
             <wp:effectExtent b="0" l="0" r="0" t="0"/>
-            <wp:docPr id="17" name="image16.png"/>
+            <wp:docPr id="17" name="image17.png"/>
             <a:graphic>
               <a:graphicData uri="http://schemas.openxmlformats.org/drawingml/2006/picture">
                 <pic:pic>
                   <pic:nvPicPr>
-                    <pic:cNvPr id="0" name="image16.png"/>
+                    <pic:cNvPr id="0" name="image17.png"/>
                     <pic:cNvPicPr preferRelativeResize="0"/>
                   </pic:nvPicPr>
                   <pic:blipFill>

</xml_diff>